<commit_message>
feat(thesis): semantic Heading styles + Hoseo .hwp paste 가이드
목적: v21 docx 를 한글 양식 (1. 논문규격(국문샘플).hwp) 에 paste 할 때
스타일 자동 매핑이 가능하도록 semantic Heading 1/2/3/4 부여.

변경 사항:
- scripts/md_to_thesis_docx.py
  _add_heading: doc.add_paragraph() → doc.add_paragraph(style="Heading N").
  기존 시각 포매팅 (bold + 폰트 크기 + level 1 center) 은 유지.
- thesis_current/v5_rewrite/박사논문_통합본_v21.docx
  재생성. style 분포: H1×15, H2×82, H3×109, H4×3 (이전: 전부 Normal).
- thesis_current/v5_rewrite/00_전면부_한글paste용.md (신규)
  표지/속표지/인준서/연구윤리 서약서/목차 5개 페이지의 paste 텍스트 +
  메타데이터 표 (학위/학과/학번/지도교수/제목 KO/EN).
- thesis_current/v5_rewrite/박사논문_통합본_v21.pdf (신규)
  docx2pdf 로 변환, 109 페이지, 5.86 MB.
  4.6배판 (188×257 mm) / 본문 바탕 10.5 pt / 200% 행간 적용 확인.

내일 한글에서: 양식 .hwp 본문 영역에 v21 docx paste → Heading 스타일이
한글 자체 스타일과 매핑되어 자동 목차 생성 가능.

Co-Authored-By: Claude Opus 4.7 (1M context) <noreply@anthropic.com>
</commit_message>
<xml_diff>
--- a/thesis_current/v5_rewrite/박사논문_통합본_v21.docx
+++ b/thesis_current/v5_rewrite/박사논문_통합본_v21.docx
@@ -4,6 +4,7 @@
   <w:body>
     <w:p>
       <w:pPr>
+        <w:pStyle w:val="Heading1"/>
         <w:spacing w:lineRule="auto" w:line="360" w:after="160"/>
         <w:jc w:val="center"/>
       </w:pPr>
@@ -18,6 +19,7 @@
     </w:p>
     <w:p>
       <w:pPr>
+        <w:pStyle w:val="Heading2"/>
         <w:spacing w:lineRule="auto" w:line="360" w:after="160"/>
       </w:pPr>
       <w:r>
@@ -96,6 +98,7 @@
     </w:p>
     <w:p>
       <w:pPr>
+        <w:pStyle w:val="Heading1"/>
         <w:spacing w:lineRule="auto" w:line="360" w:after="160"/>
         <w:jc w:val="center"/>
       </w:pPr>
@@ -110,6 +113,7 @@
     </w:p>
     <w:p>
       <w:pPr>
+        <w:pStyle w:val="Heading2"/>
         <w:spacing w:lineRule="auto" w:line="360" w:after="160"/>
       </w:pPr>
       <w:r>
@@ -409,6 +413,7 @@
     </w:p>
     <w:p>
       <w:pPr>
+        <w:pStyle w:val="Heading2"/>
         <w:spacing w:lineRule="auto" w:line="360" w:after="160"/>
       </w:pPr>
       <w:r>
@@ -474,6 +479,7 @@
     </w:p>
     <w:p>
       <w:pPr>
+        <w:pStyle w:val="Heading2"/>
         <w:spacing w:lineRule="auto" w:line="360" w:after="160"/>
       </w:pPr>
       <w:r>
@@ -500,6 +506,7 @@
     </w:p>
     <w:p>
       <w:pPr>
+        <w:pStyle w:val="Heading3"/>
         <w:spacing w:lineRule="auto" w:line="360" w:after="160"/>
       </w:pPr>
       <w:r>
@@ -539,6 +546,7 @@
     </w:p>
     <w:p>
       <w:pPr>
+        <w:pStyle w:val="Heading3"/>
         <w:spacing w:lineRule="auto" w:line="360" w:after="160"/>
       </w:pPr>
       <w:r>
@@ -591,6 +599,7 @@
     </w:p>
     <w:p>
       <w:pPr>
+        <w:pStyle w:val="Heading3"/>
         <w:spacing w:lineRule="auto" w:line="360" w:after="160"/>
       </w:pPr>
       <w:r>
@@ -617,6 +626,7 @@
     </w:p>
     <w:p>
       <w:pPr>
+        <w:pStyle w:val="Heading3"/>
         <w:spacing w:lineRule="auto" w:line="360" w:after="160"/>
       </w:pPr>
       <w:r>
@@ -669,6 +679,7 @@
     </w:p>
     <w:p>
       <w:pPr>
+        <w:pStyle w:val="Heading2"/>
         <w:spacing w:lineRule="auto" w:line="360" w:after="160"/>
       </w:pPr>
       <w:r>
@@ -848,6 +859,7 @@
     </w:p>
     <w:p>
       <w:pPr>
+        <w:pStyle w:val="Heading2"/>
         <w:spacing w:lineRule="auto" w:line="360" w:after="160"/>
       </w:pPr>
       <w:r>
@@ -959,6 +971,7 @@
     </w:p>
     <w:p>
       <w:pPr>
+        <w:pStyle w:val="Heading2"/>
         <w:spacing w:lineRule="auto" w:line="360" w:after="160"/>
       </w:pPr>
       <w:r>
@@ -1068,6 +1081,7 @@
     </w:p>
     <w:p>
       <w:pPr>
+        <w:pStyle w:val="Heading1"/>
         <w:spacing w:lineRule="auto" w:line="360" w:after="160"/>
         <w:jc w:val="center"/>
       </w:pPr>
@@ -1095,6 +1109,7 @@
     </w:p>
     <w:p>
       <w:pPr>
+        <w:pStyle w:val="Heading2"/>
         <w:spacing w:lineRule="auto" w:line="360" w:after="160"/>
       </w:pPr>
       <w:r>
@@ -1108,6 +1123,7 @@
     </w:p>
     <w:p>
       <w:pPr>
+        <w:pStyle w:val="Heading3"/>
         <w:spacing w:lineRule="auto" w:line="360" w:after="160"/>
       </w:pPr>
       <w:r>
@@ -1134,6 +1150,7 @@
     </w:p>
     <w:p>
       <w:pPr>
+        <w:pStyle w:val="Heading3"/>
         <w:spacing w:lineRule="auto" w:line="360" w:after="160"/>
       </w:pPr>
       <w:r>
@@ -1160,6 +1177,7 @@
     </w:p>
     <w:p>
       <w:pPr>
+        <w:pStyle w:val="Heading3"/>
         <w:spacing w:lineRule="auto" w:line="360" w:after="160"/>
       </w:pPr>
       <w:r>
@@ -1186,6 +1204,7 @@
     </w:p>
     <w:p>
       <w:pPr>
+        <w:pStyle w:val="Heading2"/>
         <w:spacing w:lineRule="auto" w:line="360" w:after="160"/>
       </w:pPr>
       <w:r>
@@ -1199,6 +1218,7 @@
     </w:p>
     <w:p>
       <w:pPr>
+        <w:pStyle w:val="Heading3"/>
         <w:spacing w:lineRule="auto" w:line="360" w:after="160"/>
       </w:pPr>
       <w:r>
@@ -1225,6 +1245,7 @@
     </w:p>
     <w:p>
       <w:pPr>
+        <w:pStyle w:val="Heading3"/>
         <w:spacing w:lineRule="auto" w:line="360" w:after="160"/>
       </w:pPr>
       <w:r>
@@ -1251,6 +1272,7 @@
     </w:p>
     <w:p>
       <w:pPr>
+        <w:pStyle w:val="Heading2"/>
         <w:spacing w:lineRule="auto" w:line="360" w:after="160"/>
       </w:pPr>
       <w:r>
@@ -1264,6 +1286,7 @@
     </w:p>
     <w:p>
       <w:pPr>
+        <w:pStyle w:val="Heading3"/>
         <w:spacing w:lineRule="auto" w:line="360" w:after="160"/>
       </w:pPr>
       <w:r>
@@ -1290,6 +1313,7 @@
     </w:p>
     <w:p>
       <w:pPr>
+        <w:pStyle w:val="Heading3"/>
         <w:spacing w:lineRule="auto" w:line="360" w:after="160"/>
       </w:pPr>
       <w:r>
@@ -1316,6 +1340,7 @@
     </w:p>
     <w:p>
       <w:pPr>
+        <w:pStyle w:val="Heading3"/>
         <w:spacing w:lineRule="auto" w:line="360" w:after="160"/>
       </w:pPr>
       <w:r>
@@ -1342,6 +1367,7 @@
     </w:p>
     <w:p>
       <w:pPr>
+        <w:pStyle w:val="Heading2"/>
         <w:spacing w:lineRule="auto" w:line="360" w:after="160"/>
       </w:pPr>
       <w:r>
@@ -1355,6 +1381,7 @@
     </w:p>
     <w:p>
       <w:pPr>
+        <w:pStyle w:val="Heading3"/>
         <w:spacing w:lineRule="auto" w:line="360" w:after="160"/>
       </w:pPr>
       <w:r>
@@ -1381,6 +1408,7 @@
     </w:p>
     <w:p>
       <w:pPr>
+        <w:pStyle w:val="Heading3"/>
         <w:spacing w:lineRule="auto" w:line="360" w:after="160"/>
       </w:pPr>
       <w:r>
@@ -1599,6 +1627,7 @@
     </w:p>
     <w:p>
       <w:pPr>
+        <w:pStyle w:val="Heading2"/>
         <w:spacing w:lineRule="auto" w:line="360" w:after="160"/>
       </w:pPr>
       <w:r>
@@ -1899,6 +1928,7 @@
     </w:p>
     <w:p>
       <w:pPr>
+        <w:pStyle w:val="Heading2"/>
         <w:spacing w:lineRule="auto" w:line="360" w:after="160"/>
       </w:pPr>
       <w:r>
@@ -1925,6 +1955,7 @@
     </w:p>
     <w:p>
       <w:pPr>
+        <w:pStyle w:val="Heading3"/>
         <w:spacing w:lineRule="auto" w:line="360" w:after="160"/>
       </w:pPr>
       <w:r>
@@ -1964,6 +1995,7 @@
     </w:p>
     <w:p>
       <w:pPr>
+        <w:pStyle w:val="Heading3"/>
         <w:spacing w:lineRule="auto" w:line="360" w:after="160"/>
       </w:pPr>
       <w:r>
@@ -2688,6 +2720,7 @@
     </w:tbl>
     <w:p>
       <w:pPr>
+        <w:pStyle w:val="Heading3"/>
         <w:spacing w:lineRule="auto" w:line="360" w:after="160"/>
       </w:pPr>
       <w:r>
@@ -2753,6 +2786,7 @@
     </w:p>
     <w:p>
       <w:pPr>
+        <w:pStyle w:val="Heading3"/>
         <w:spacing w:lineRule="auto" w:line="360" w:after="160"/>
       </w:pPr>
       <w:r>
@@ -2792,6 +2826,7 @@
     </w:p>
     <w:p>
       <w:pPr>
+        <w:pStyle w:val="Heading3"/>
         <w:spacing w:lineRule="auto" w:line="360" w:after="160"/>
       </w:pPr>
       <w:r>
@@ -2818,6 +2853,7 @@
     </w:p>
     <w:p>
       <w:pPr>
+        <w:pStyle w:val="Heading1"/>
         <w:spacing w:lineRule="auto" w:line="360" w:after="160"/>
         <w:jc w:val="center"/>
       </w:pPr>
@@ -2845,6 +2881,7 @@
     </w:p>
     <w:p>
       <w:pPr>
+        <w:pStyle w:val="Heading2"/>
         <w:spacing w:lineRule="auto" w:line="360" w:after="160"/>
       </w:pPr>
       <w:r>
@@ -2962,6 +2999,7 @@
     </w:p>
     <w:p>
       <w:pPr>
+        <w:pStyle w:val="Heading2"/>
         <w:spacing w:lineRule="auto" w:line="360" w:after="160"/>
       </w:pPr>
       <w:r>
@@ -2975,6 +3013,7 @@
     </w:p>
     <w:p>
       <w:pPr>
+        <w:pStyle w:val="Heading3"/>
         <w:spacing w:lineRule="auto" w:line="360" w:after="160"/>
       </w:pPr>
       <w:r>
@@ -3027,6 +3066,7 @@
     </w:p>
     <w:p>
       <w:pPr>
+        <w:pStyle w:val="Heading3"/>
         <w:spacing w:lineRule="auto" w:line="360" w:after="160"/>
       </w:pPr>
       <w:r>
@@ -3079,6 +3119,7 @@
     </w:p>
     <w:p>
       <w:pPr>
+        <w:pStyle w:val="Heading3"/>
         <w:spacing w:lineRule="auto" w:line="360" w:after="160"/>
       </w:pPr>
       <w:r>
@@ -3118,6 +3159,7 @@
     </w:p>
     <w:p>
       <w:pPr>
+        <w:pStyle w:val="Heading2"/>
         <w:spacing w:lineRule="auto" w:line="360" w:after="160"/>
       </w:pPr>
       <w:r>
@@ -3443,6 +3485,7 @@
     </w:p>
     <w:p>
       <w:pPr>
+        <w:pStyle w:val="Heading2"/>
         <w:spacing w:lineRule="auto" w:line="360" w:after="160"/>
       </w:pPr>
       <w:r>
@@ -3742,6 +3785,7 @@
     </w:p>
     <w:p>
       <w:pPr>
+        <w:pStyle w:val="Heading2"/>
         <w:spacing w:lineRule="auto" w:line="360" w:after="160"/>
       </w:pPr>
       <w:r>
@@ -3853,6 +3897,7 @@
     </w:p>
     <w:p>
       <w:pPr>
+        <w:pStyle w:val="Heading2"/>
         <w:spacing w:lineRule="auto" w:line="360" w:after="160"/>
       </w:pPr>
       <w:r>
@@ -3924,6 +3969,7 @@
     </w:p>
     <w:p>
       <w:pPr>
+        <w:pStyle w:val="Heading2"/>
         <w:spacing w:lineRule="auto" w:line="360" w:after="160"/>
       </w:pPr>
       <w:r>
@@ -3950,6 +3996,7 @@
     </w:p>
     <w:p>
       <w:pPr>
+        <w:pStyle w:val="Heading1"/>
         <w:spacing w:lineRule="auto" w:line="360" w:after="160"/>
         <w:jc w:val="center"/>
       </w:pPr>
@@ -3977,6 +4024,7 @@
     </w:p>
     <w:p>
       <w:pPr>
+        <w:pStyle w:val="Heading2"/>
         <w:spacing w:lineRule="auto" w:line="360" w:after="160"/>
       </w:pPr>
       <w:r>
@@ -4643,6 +4691,7 @@
     </w:p>
     <w:p>
       <w:pPr>
+        <w:pStyle w:val="Heading2"/>
         <w:spacing w:lineRule="auto" w:line="360" w:after="160"/>
       </w:pPr>
       <w:r>
@@ -4669,6 +4718,7 @@
     </w:p>
     <w:p>
       <w:pPr>
+        <w:pStyle w:val="Heading2"/>
         <w:spacing w:lineRule="auto" w:line="360" w:after="160"/>
       </w:pPr>
       <w:r>
@@ -4800,6 +4850,7 @@
     </w:p>
     <w:p>
       <w:pPr>
+        <w:pStyle w:val="Heading2"/>
         <w:spacing w:lineRule="auto" w:line="360" w:after="160"/>
       </w:pPr>
       <w:r>
@@ -4852,6 +4903,7 @@
     </w:p>
     <w:p>
       <w:pPr>
+        <w:pStyle w:val="Heading2"/>
         <w:spacing w:lineRule="auto" w:line="360" w:after="160"/>
       </w:pPr>
       <w:r>
@@ -4865,6 +4917,7 @@
     </w:p>
     <w:p>
       <w:pPr>
+        <w:pStyle w:val="Heading3"/>
         <w:spacing w:lineRule="auto" w:line="360" w:after="160"/>
       </w:pPr>
       <w:r>
@@ -5182,6 +5235,7 @@
     </w:p>
     <w:p>
       <w:pPr>
+        <w:pStyle w:val="Heading3"/>
         <w:spacing w:lineRule="auto" w:line="360" w:after="160"/>
       </w:pPr>
       <w:r>
@@ -5610,6 +5664,7 @@
     </w:p>
     <w:p>
       <w:pPr>
+        <w:pStyle w:val="Heading3"/>
         <w:spacing w:lineRule="auto" w:line="360" w:after="160"/>
       </w:pPr>
       <w:r>
@@ -5961,6 +6016,7 @@
     </w:p>
     <w:p>
       <w:pPr>
+        <w:pStyle w:val="Heading2"/>
         <w:spacing w:lineRule="auto" w:line="360" w:after="160"/>
       </w:pPr>
       <w:r>
@@ -5987,6 +6043,7 @@
     </w:p>
     <w:p>
       <w:pPr>
+        <w:pStyle w:val="Heading1"/>
         <w:spacing w:lineRule="auto" w:line="360" w:after="160"/>
         <w:jc w:val="center"/>
       </w:pPr>
@@ -6014,6 +6071,7 @@
     </w:p>
     <w:p>
       <w:pPr>
+        <w:pStyle w:val="Heading2"/>
         <w:spacing w:lineRule="auto" w:line="360" w:after="160"/>
       </w:pPr>
       <w:r>
@@ -6040,6 +6098,7 @@
     </w:p>
     <w:p>
       <w:pPr>
+        <w:pStyle w:val="Heading3"/>
         <w:spacing w:lineRule="auto" w:line="360" w:after="160"/>
       </w:pPr>
       <w:r>
@@ -6550,6 +6609,7 @@
     </w:p>
     <w:p>
       <w:pPr>
+        <w:pStyle w:val="Heading3"/>
         <w:spacing w:lineRule="auto" w:line="360" w:after="160"/>
       </w:pPr>
       <w:r>
@@ -6602,6 +6662,7 @@
     </w:p>
     <w:p>
       <w:pPr>
+        <w:pStyle w:val="Heading3"/>
         <w:spacing w:lineRule="auto" w:line="360" w:after="160"/>
       </w:pPr>
       <w:r>
@@ -6667,6 +6728,7 @@
     </w:p>
     <w:p>
       <w:pPr>
+        <w:pStyle w:val="Heading3"/>
         <w:spacing w:lineRule="auto" w:line="360" w:after="160"/>
       </w:pPr>
       <w:r>
@@ -6969,6 +7031,7 @@
     </w:p>
     <w:p>
       <w:pPr>
+        <w:pStyle w:val="Heading2"/>
         <w:spacing w:lineRule="auto" w:line="360" w:after="160"/>
       </w:pPr>
       <w:r>
@@ -6982,6 +7045,7 @@
     </w:p>
     <w:p>
       <w:pPr>
+        <w:pStyle w:val="Heading3"/>
         <w:spacing w:lineRule="auto" w:line="360" w:after="160"/>
       </w:pPr>
       <w:r>
@@ -7067,6 +7131,7 @@
     </w:p>
     <w:p>
       <w:pPr>
+        <w:pStyle w:val="Heading3"/>
         <w:spacing w:lineRule="auto" w:line="360" w:after="160"/>
       </w:pPr>
       <w:r>
@@ -7471,6 +7536,7 @@
     </w:p>
     <w:p>
       <w:pPr>
+        <w:pStyle w:val="Heading3"/>
         <w:spacing w:lineRule="auto" w:line="360" w:after="160"/>
       </w:pPr>
       <w:r>
@@ -7497,6 +7563,7 @@
     </w:p>
     <w:p>
       <w:pPr>
+        <w:pStyle w:val="Heading2"/>
         <w:spacing w:lineRule="auto" w:line="360" w:after="160"/>
       </w:pPr>
       <w:r>
@@ -7510,6 +7577,7 @@
     </w:p>
     <w:p>
       <w:pPr>
+        <w:pStyle w:val="Heading3"/>
         <w:spacing w:lineRule="auto" w:line="360" w:after="160"/>
       </w:pPr>
       <w:r>
@@ -7889,6 +7957,7 @@
     </w:p>
     <w:p>
       <w:pPr>
+        <w:pStyle w:val="Heading3"/>
         <w:spacing w:lineRule="auto" w:line="360" w:after="160"/>
       </w:pPr>
       <w:r>
@@ -8622,6 +8691,7 @@
     </w:tbl>
     <w:p>
       <w:pPr>
+        <w:pStyle w:val="Heading3"/>
         <w:spacing w:lineRule="auto" w:line="360" w:after="160"/>
       </w:pPr>
       <w:r>
@@ -8648,6 +8718,7 @@
     </w:p>
     <w:p>
       <w:pPr>
+        <w:pStyle w:val="Heading3"/>
         <w:spacing w:lineRule="auto" w:line="360" w:after="160"/>
       </w:pPr>
       <w:r>
@@ -8729,6 +8800,7 @@
     </w:p>
     <w:p>
       <w:pPr>
+        <w:pStyle w:val="Heading3"/>
         <w:spacing w:lineRule="auto" w:line="360" w:after="160"/>
       </w:pPr>
       <w:r>
@@ -8808,6 +8880,7 @@
     </w:p>
     <w:p>
       <w:pPr>
+        <w:pStyle w:val="Heading3"/>
         <w:spacing w:lineRule="auto" w:line="360" w:after="160"/>
       </w:pPr>
       <w:r>
@@ -8939,6 +9012,7 @@
     </w:p>
     <w:p>
       <w:pPr>
+        <w:pStyle w:val="Heading3"/>
         <w:spacing w:lineRule="auto" w:line="360" w:after="160"/>
       </w:pPr>
       <w:r>
@@ -9011,6 +9085,7 @@
     </w:p>
     <w:p>
       <w:pPr>
+        <w:pStyle w:val="Heading2"/>
         <w:spacing w:lineRule="auto" w:line="360" w:after="160"/>
       </w:pPr>
       <w:r>
@@ -9024,6 +9099,7 @@
     </w:p>
     <w:p>
       <w:pPr>
+        <w:pStyle w:val="Heading3"/>
         <w:spacing w:lineRule="auto" w:line="360" w:after="160"/>
       </w:pPr>
       <w:r>
@@ -9050,6 +9126,7 @@
     </w:p>
     <w:p>
       <w:pPr>
+        <w:pStyle w:val="Heading3"/>
         <w:spacing w:lineRule="auto" w:line="360" w:after="160"/>
       </w:pPr>
       <w:r>
@@ -9123,6 +9200,7 @@
     </w:p>
     <w:p>
       <w:pPr>
+        <w:pStyle w:val="Heading3"/>
         <w:spacing w:lineRule="auto" w:line="360" w:after="160"/>
       </w:pPr>
       <w:r>
@@ -9149,6 +9227,7 @@
     </w:p>
     <w:p>
       <w:pPr>
+        <w:pStyle w:val="Heading3"/>
         <w:spacing w:lineRule="auto" w:line="360" w:after="160"/>
       </w:pPr>
       <w:r>
@@ -9364,6 +9443,7 @@
     </w:p>
     <w:p>
       <w:pPr>
+        <w:pStyle w:val="Heading3"/>
         <w:spacing w:lineRule="auto" w:line="360" w:after="160"/>
       </w:pPr>
       <w:r>
@@ -9390,6 +9470,7 @@
     </w:p>
     <w:p>
       <w:pPr>
+        <w:pStyle w:val="Heading2"/>
         <w:spacing w:lineRule="auto" w:line="360" w:after="160"/>
       </w:pPr>
       <w:r>
@@ -9403,6 +9484,7 @@
     </w:p>
     <w:p>
       <w:pPr>
+        <w:pStyle w:val="Heading3"/>
         <w:spacing w:lineRule="auto" w:line="360" w:after="160"/>
       </w:pPr>
       <w:r>
@@ -9470,6 +9552,7 @@
     </w:p>
     <w:p>
       <w:pPr>
+        <w:pStyle w:val="Heading3"/>
         <w:spacing w:lineRule="auto" w:line="360" w:after="160"/>
       </w:pPr>
       <w:r>
@@ -9509,6 +9592,7 @@
     </w:p>
     <w:p>
       <w:pPr>
+        <w:pStyle w:val="Heading3"/>
         <w:spacing w:lineRule="auto" w:line="360" w:after="160"/>
       </w:pPr>
       <w:r>
@@ -9562,6 +9646,7 @@
     </w:p>
     <w:p>
       <w:pPr>
+        <w:pStyle w:val="Heading2"/>
         <w:spacing w:lineRule="auto" w:line="360" w:after="160"/>
       </w:pPr>
       <w:r>
@@ -9588,6 +9673,7 @@
     </w:p>
     <w:p>
       <w:pPr>
+        <w:pStyle w:val="Heading1"/>
         <w:spacing w:lineRule="auto" w:line="360" w:after="160"/>
         <w:jc w:val="center"/>
       </w:pPr>
@@ -9615,6 +9701,7 @@
     </w:p>
     <w:p>
       <w:pPr>
+        <w:pStyle w:val="Heading2"/>
         <w:spacing w:lineRule="auto" w:line="360" w:after="160"/>
       </w:pPr>
       <w:r>
@@ -9628,6 +9715,7 @@
     </w:p>
     <w:p>
       <w:pPr>
+        <w:pStyle w:val="Heading3"/>
         <w:spacing w:lineRule="auto" w:line="360" w:after="160"/>
       </w:pPr>
       <w:r>
@@ -9697,6 +9785,7 @@
     </w:p>
     <w:p>
       <w:pPr>
+        <w:pStyle w:val="Heading3"/>
         <w:spacing w:lineRule="auto" w:line="360" w:after="160"/>
       </w:pPr>
       <w:r>
@@ -9752,6 +9841,7 @@
     </w:p>
     <w:p>
       <w:pPr>
+        <w:pStyle w:val="Heading3"/>
         <w:spacing w:lineRule="auto" w:line="360" w:after="160"/>
       </w:pPr>
       <w:r>
@@ -10664,6 +10754,7 @@
     </w:p>
     <w:p>
       <w:pPr>
+        <w:pStyle w:val="Heading3"/>
         <w:spacing w:lineRule="auto" w:line="360" w:after="160"/>
       </w:pPr>
       <w:r>
@@ -10690,6 +10781,7 @@
     </w:p>
     <w:p>
       <w:pPr>
+        <w:pStyle w:val="Heading3"/>
         <w:spacing w:lineRule="auto" w:line="360" w:after="160"/>
       </w:pPr>
       <w:r>
@@ -10745,6 +10837,7 @@
     </w:p>
     <w:p>
       <w:pPr>
+        <w:pStyle w:val="Heading3"/>
         <w:spacing w:lineRule="auto" w:line="360" w:after="160"/>
       </w:pPr>
       <w:r>
@@ -10771,6 +10864,7 @@
     </w:p>
     <w:p>
       <w:pPr>
+        <w:pStyle w:val="Heading2"/>
         <w:spacing w:lineRule="auto" w:line="360" w:after="160"/>
       </w:pPr>
       <w:r>
@@ -10784,6 +10878,7 @@
     </w:p>
     <w:p>
       <w:pPr>
+        <w:pStyle w:val="Heading3"/>
         <w:spacing w:lineRule="auto" w:line="360" w:after="160"/>
       </w:pPr>
       <w:r>
@@ -10810,6 +10905,7 @@
     </w:p>
     <w:p>
       <w:pPr>
+        <w:pStyle w:val="Heading3"/>
         <w:spacing w:lineRule="auto" w:line="360" w:after="160"/>
       </w:pPr>
       <w:r>
@@ -10836,6 +10932,7 @@
     </w:p>
     <w:p>
       <w:pPr>
+        <w:pStyle w:val="Heading3"/>
         <w:spacing w:lineRule="auto" w:line="360" w:after="160"/>
       </w:pPr>
       <w:r>
@@ -10941,6 +11038,7 @@
     </w:p>
     <w:p>
       <w:pPr>
+        <w:pStyle w:val="Heading2"/>
         <w:spacing w:lineRule="auto" w:line="360" w:after="160"/>
       </w:pPr>
       <w:r>
@@ -10967,6 +11065,7 @@
     </w:p>
     <w:p>
       <w:pPr>
+        <w:pStyle w:val="Heading3"/>
         <w:spacing w:lineRule="auto" w:line="360" w:after="160"/>
       </w:pPr>
       <w:r>
@@ -11614,6 +11713,7 @@
     </w:p>
     <w:p>
       <w:pPr>
+        <w:pStyle w:val="Heading3"/>
         <w:spacing w:lineRule="auto" w:line="360" w:after="160"/>
       </w:pPr>
       <w:r>
@@ -12331,6 +12431,7 @@
     </w:tbl>
     <w:p>
       <w:pPr>
+        <w:pStyle w:val="Heading3"/>
         <w:spacing w:lineRule="auto" w:line="360" w:after="160"/>
       </w:pPr>
       <w:r>
@@ -12474,6 +12575,7 @@
     </w:p>
     <w:p>
       <w:pPr>
+        <w:pStyle w:val="Heading3"/>
         <w:spacing w:lineRule="auto" w:line="360" w:after="160"/>
       </w:pPr>
       <w:r>
@@ -12732,6 +12834,7 @@
     </w:p>
     <w:p>
       <w:pPr>
+        <w:pStyle w:val="Heading3"/>
         <w:spacing w:lineRule="auto" w:line="360" w:after="160"/>
       </w:pPr>
       <w:r>
@@ -13270,6 +13373,7 @@
     </w:p>
     <w:p>
       <w:pPr>
+        <w:pStyle w:val="Heading3"/>
         <w:spacing w:lineRule="auto" w:line="360" w:after="160"/>
       </w:pPr>
       <w:r>
@@ -14003,6 +14107,7 @@
     </w:p>
     <w:p>
       <w:pPr>
+        <w:pStyle w:val="Heading3"/>
         <w:spacing w:lineRule="auto" w:line="360" w:after="160"/>
       </w:pPr>
       <w:r>
@@ -14083,6 +14188,7 @@
     </w:p>
     <w:p>
       <w:pPr>
+        <w:pStyle w:val="Heading2"/>
         <w:spacing w:lineRule="auto" w:line="360" w:after="160"/>
       </w:pPr>
       <w:r>
@@ -14096,6 +14202,7 @@
     </w:p>
     <w:p>
       <w:pPr>
+        <w:pStyle w:val="Heading3"/>
         <w:spacing w:lineRule="auto" w:line="360" w:after="160"/>
       </w:pPr>
       <w:r>
@@ -14906,6 +15013,7 @@
     </w:tbl>
     <w:p>
       <w:pPr>
+        <w:pStyle w:val="Heading3"/>
         <w:spacing w:lineRule="auto" w:line="360" w:after="160"/>
       </w:pPr>
       <w:r>
@@ -14986,6 +15094,7 @@
     </w:p>
     <w:p>
       <w:pPr>
+        <w:pStyle w:val="Heading3"/>
         <w:spacing w:lineRule="auto" w:line="360" w:after="160"/>
       </w:pPr>
       <w:r>
@@ -15012,6 +15121,7 @@
     </w:p>
     <w:p>
       <w:pPr>
+        <w:pStyle w:val="Heading2"/>
         <w:spacing w:lineRule="auto" w:line="360" w:after="160"/>
       </w:pPr>
       <w:r>
@@ -15025,6 +15135,7 @@
     </w:p>
     <w:p>
       <w:pPr>
+        <w:pStyle w:val="Heading3"/>
         <w:spacing w:lineRule="auto" w:line="360" w:after="160"/>
       </w:pPr>
       <w:r>
@@ -15466,6 +15577,7 @@
     </w:p>
     <w:p>
       <w:pPr>
+        <w:pStyle w:val="Heading3"/>
         <w:spacing w:lineRule="auto" w:line="360" w:after="160"/>
       </w:pPr>
       <w:r>
@@ -15575,6 +15687,7 @@
     </w:p>
     <w:p>
       <w:pPr>
+        <w:pStyle w:val="Heading3"/>
         <w:spacing w:lineRule="auto" w:line="360" w:after="160"/>
       </w:pPr>
       <w:r>
@@ -15601,6 +15714,7 @@
     </w:p>
     <w:p>
       <w:pPr>
+        <w:pStyle w:val="Heading2"/>
         <w:spacing w:lineRule="auto" w:line="360" w:after="160"/>
       </w:pPr>
       <w:r>
@@ -15878,6 +15992,7 @@
     </w:p>
     <w:p>
       <w:pPr>
+        <w:pStyle w:val="Heading2"/>
         <w:spacing w:lineRule="auto" w:line="360" w:after="160"/>
       </w:pPr>
       <w:r>
@@ -15891,6 +16006,7 @@
     </w:p>
     <w:p>
       <w:pPr>
+        <w:pStyle w:val="Heading3"/>
         <w:spacing w:lineRule="auto" w:line="360" w:after="160"/>
       </w:pPr>
       <w:r>
@@ -15917,6 +16033,7 @@
     </w:p>
     <w:p>
       <w:pPr>
+        <w:pStyle w:val="Heading3"/>
         <w:spacing w:lineRule="auto" w:line="360" w:after="160"/>
       </w:pPr>
       <w:r>
@@ -15930,6 +16047,7 @@
     </w:p>
     <w:p>
       <w:pPr>
+        <w:pStyle w:val="Heading4"/>
         <w:spacing w:lineRule="auto" w:line="360" w:after="160"/>
       </w:pPr>
       <w:r>
@@ -16268,6 +16386,7 @@
     </w:tbl>
     <w:p>
       <w:pPr>
+        <w:pStyle w:val="Heading4"/>
         <w:spacing w:lineRule="auto" w:line="360" w:after="160"/>
       </w:pPr>
       <w:r>
@@ -16606,6 +16725,7 @@
     </w:tbl>
     <w:p>
       <w:pPr>
+        <w:pStyle w:val="Heading4"/>
         <w:spacing w:lineRule="auto" w:line="360" w:after="160"/>
       </w:pPr>
       <w:r>
@@ -16944,6 +17064,7 @@
     </w:tbl>
     <w:p>
       <w:pPr>
+        <w:pStyle w:val="Heading3"/>
         <w:spacing w:lineRule="auto" w:line="360" w:after="160"/>
       </w:pPr>
       <w:r>
@@ -17022,6 +17143,7 @@
     </w:p>
     <w:p>
       <w:pPr>
+        <w:pStyle w:val="Heading3"/>
         <w:spacing w:lineRule="auto" w:line="360" w:after="160"/>
       </w:pPr>
       <w:r>
@@ -17061,6 +17183,7 @@
     </w:p>
     <w:p>
       <w:pPr>
+        <w:pStyle w:val="Heading3"/>
         <w:spacing w:lineRule="auto" w:line="360" w:after="160"/>
       </w:pPr>
       <w:r>
@@ -17347,6 +17470,7 @@
     </w:p>
     <w:p>
       <w:pPr>
+        <w:pStyle w:val="Heading3"/>
         <w:spacing w:lineRule="auto" w:line="360" w:after="160"/>
       </w:pPr>
       <w:r>
@@ -17778,6 +17902,7 @@
     </w:p>
     <w:p>
       <w:pPr>
+        <w:pStyle w:val="Heading3"/>
         <w:spacing w:lineRule="auto" w:line="360" w:after="160"/>
       </w:pPr>
       <w:r>
@@ -18390,6 +18515,7 @@
     </w:p>
     <w:p>
       <w:pPr>
+        <w:pStyle w:val="Heading3"/>
         <w:spacing w:lineRule="auto" w:line="360" w:after="160"/>
       </w:pPr>
       <w:r>
@@ -18442,6 +18568,7 @@
     </w:p>
     <w:p>
       <w:pPr>
+        <w:pStyle w:val="Heading2"/>
         <w:spacing w:lineRule="auto" w:line="360" w:after="160"/>
       </w:pPr>
       <w:r>
@@ -18455,6 +18582,7 @@
     </w:p>
     <w:p>
       <w:pPr>
+        <w:pStyle w:val="Heading3"/>
         <w:spacing w:lineRule="auto" w:line="360" w:after="160"/>
       </w:pPr>
       <w:r>
@@ -18538,6 +18666,7 @@
     </w:p>
     <w:p>
       <w:pPr>
+        <w:pStyle w:val="Heading3"/>
         <w:spacing w:lineRule="auto" w:line="360" w:after="160"/>
       </w:pPr>
       <w:r>
@@ -18621,6 +18750,7 @@
     </w:p>
     <w:p>
       <w:pPr>
+        <w:pStyle w:val="Heading2"/>
         <w:spacing w:lineRule="auto" w:line="360" w:after="160"/>
       </w:pPr>
       <w:r>
@@ -18744,6 +18874,7 @@
     </w:p>
     <w:p>
       <w:pPr>
+        <w:pStyle w:val="Heading1"/>
         <w:spacing w:lineRule="auto" w:line="360" w:after="160"/>
         <w:jc w:val="center"/>
       </w:pPr>
@@ -18786,6 +18917,7 @@
     </w:p>
     <w:p>
       <w:pPr>
+        <w:pStyle w:val="Heading2"/>
         <w:spacing w:lineRule="auto" w:line="360" w:after="160"/>
       </w:pPr>
       <w:r>
@@ -19240,6 +19372,7 @@
     </w:p>
     <w:p>
       <w:pPr>
+        <w:pStyle w:val="Heading2"/>
         <w:spacing w:lineRule="auto" w:line="360" w:after="160"/>
       </w:pPr>
       <w:r>
@@ -19681,6 +19814,7 @@
     </w:p>
     <w:p>
       <w:pPr>
+        <w:pStyle w:val="Heading2"/>
         <w:spacing w:lineRule="auto" w:line="360" w:after="160"/>
       </w:pPr>
       <w:r>
@@ -20306,6 +20440,7 @@
     </w:p>
     <w:p>
       <w:pPr>
+        <w:pStyle w:val="Heading2"/>
         <w:spacing w:lineRule="auto" w:line="360" w:after="160"/>
       </w:pPr>
       <w:r>
@@ -20650,6 +20785,7 @@
     </w:p>
     <w:p>
       <w:pPr>
+        <w:pStyle w:val="Heading2"/>
         <w:spacing w:lineRule="auto" w:line="360" w:after="160"/>
       </w:pPr>
       <w:r>
@@ -20937,6 +21073,7 @@
     </w:p>
     <w:p>
       <w:pPr>
+        <w:pStyle w:val="Heading2"/>
         <w:spacing w:lineRule="auto" w:line="360" w:after="160"/>
       </w:pPr>
       <w:r>
@@ -21378,6 +21515,7 @@
     </w:p>
     <w:p>
       <w:pPr>
+        <w:pStyle w:val="Heading2"/>
         <w:spacing w:lineRule="auto" w:line="360" w:after="160"/>
       </w:pPr>
       <w:r>
@@ -21501,6 +21639,7 @@
     </w:p>
     <w:p>
       <w:pPr>
+        <w:pStyle w:val="Heading1"/>
         <w:spacing w:lineRule="auto" w:line="360" w:after="160"/>
         <w:jc w:val="center"/>
       </w:pPr>
@@ -21543,6 +21682,7 @@
     </w:p>
     <w:p>
       <w:pPr>
+        <w:pStyle w:val="Heading2"/>
         <w:spacing w:lineRule="auto" w:line="360" w:after="160"/>
       </w:pPr>
       <w:r>
@@ -21961,6 +22101,7 @@
     </w:p>
     <w:p>
       <w:pPr>
+        <w:pStyle w:val="Heading2"/>
         <w:spacing w:lineRule="auto" w:line="360" w:after="160"/>
       </w:pPr>
       <w:r>
@@ -22320,6 +22461,7 @@
     </w:p>
     <w:p>
       <w:pPr>
+        <w:pStyle w:val="Heading2"/>
         <w:spacing w:lineRule="auto" w:line="360" w:after="160"/>
       </w:pPr>
       <w:r>
@@ -22570,6 +22712,7 @@
     </w:p>
     <w:p>
       <w:pPr>
+        <w:pStyle w:val="Heading2"/>
         <w:spacing w:lineRule="auto" w:line="360" w:after="160"/>
       </w:pPr>
       <w:r>
@@ -22820,6 +22963,7 @@
     </w:p>
     <w:p>
       <w:pPr>
+        <w:pStyle w:val="Heading2"/>
         <w:spacing w:lineRule="auto" w:line="360" w:after="160"/>
       </w:pPr>
       <w:r>
@@ -22859,6 +23003,7 @@
     </w:p>
     <w:p>
       <w:pPr>
+        <w:pStyle w:val="Heading2"/>
         <w:spacing w:lineRule="auto" w:line="360" w:after="160"/>
       </w:pPr>
       <w:r>
@@ -23029,6 +23174,7 @@
     </w:p>
     <w:p>
       <w:pPr>
+        <w:pStyle w:val="Heading2"/>
         <w:spacing w:lineRule="auto" w:line="360" w:after="160"/>
       </w:pPr>
       <w:r>
@@ -23493,6 +23639,7 @@
     </w:p>
     <w:p>
       <w:pPr>
+        <w:pStyle w:val="Heading1"/>
         <w:spacing w:lineRule="auto" w:line="360" w:after="160"/>
         <w:jc w:val="center"/>
       </w:pPr>
@@ -23507,6 +23654,7 @@
     </w:p>
     <w:p>
       <w:pPr>
+        <w:pStyle w:val="Heading2"/>
         <w:spacing w:lineRule="auto" w:line="360" w:after="160"/>
       </w:pPr>
       <w:r>
@@ -23559,6 +23707,7 @@
     </w:p>
     <w:p>
       <w:pPr>
+        <w:pStyle w:val="Heading2"/>
         <w:spacing w:lineRule="auto" w:line="360" w:after="160"/>
       </w:pPr>
       <w:r>
@@ -23572,6 +23721,7 @@
     </w:p>
     <w:p>
       <w:pPr>
+        <w:pStyle w:val="Heading3"/>
         <w:spacing w:lineRule="auto" w:line="360" w:after="160"/>
       </w:pPr>
       <w:r>
@@ -23598,6 +23748,7 @@
     </w:p>
     <w:p>
       <w:pPr>
+        <w:pStyle w:val="Heading3"/>
         <w:spacing w:lineRule="auto" w:line="360" w:after="160"/>
       </w:pPr>
       <w:r>
@@ -23624,6 +23775,7 @@
     </w:p>
     <w:p>
       <w:pPr>
+        <w:pStyle w:val="Heading3"/>
         <w:spacing w:lineRule="auto" w:line="360" w:after="160"/>
       </w:pPr>
       <w:r>
@@ -23663,6 +23815,7 @@
     </w:p>
     <w:p>
       <w:pPr>
+        <w:pStyle w:val="Heading3"/>
         <w:spacing w:lineRule="auto" w:line="360" w:after="160"/>
       </w:pPr>
       <w:r>
@@ -24620,6 +24773,7 @@
     </w:p>
     <w:p>
       <w:pPr>
+        <w:pStyle w:val="Heading2"/>
         <w:spacing w:lineRule="auto" w:line="360" w:after="160"/>
       </w:pPr>
       <w:r>
@@ -24672,6 +24826,7 @@
     </w:p>
     <w:p>
       <w:pPr>
+        <w:pStyle w:val="Heading2"/>
         <w:spacing w:lineRule="auto" w:line="360" w:after="160"/>
       </w:pPr>
       <w:r>
@@ -24685,6 +24840,7 @@
     </w:p>
     <w:p>
       <w:pPr>
+        <w:pStyle w:val="Heading3"/>
         <w:spacing w:lineRule="auto" w:line="360" w:after="160"/>
       </w:pPr>
       <w:r>
@@ -24737,6 +24893,7 @@
     </w:p>
     <w:p>
       <w:pPr>
+        <w:pStyle w:val="Heading3"/>
         <w:spacing w:lineRule="auto" w:line="360" w:after="160"/>
       </w:pPr>
       <w:r>
@@ -24815,6 +24972,7 @@
     </w:p>
     <w:p>
       <w:pPr>
+        <w:pStyle w:val="Heading2"/>
         <w:spacing w:lineRule="auto" w:line="360" w:after="160"/>
       </w:pPr>
       <w:r>
@@ -24867,6 +25025,7 @@
     </w:p>
     <w:p>
       <w:pPr>
+        <w:pStyle w:val="Heading2"/>
         <w:spacing w:lineRule="auto" w:line="360" w:after="160"/>
       </w:pPr>
       <w:r>
@@ -24906,6 +25065,7 @@
     </w:p>
     <w:p>
       <w:pPr>
+        <w:pStyle w:val="Heading1"/>
         <w:spacing w:lineRule="auto" w:line="360" w:after="160"/>
         <w:jc w:val="center"/>
       </w:pPr>
@@ -24934,6 +25094,7 @@
     </w:p>
     <w:p>
       <w:pPr>
+        <w:pStyle w:val="Heading2"/>
         <w:spacing w:lineRule="auto" w:line="360" w:after="160"/>
       </w:pPr>
       <w:r>
@@ -24947,6 +25108,7 @@
     </w:p>
     <w:p>
       <w:pPr>
+        <w:pStyle w:val="Heading3"/>
         <w:spacing w:lineRule="auto" w:line="360" w:after="160"/>
       </w:pPr>
       <w:r>
@@ -25739,6 +25901,7 @@
     </w:tbl>
     <w:p>
       <w:pPr>
+        <w:pStyle w:val="Heading3"/>
         <w:spacing w:lineRule="auto" w:line="360" w:after="160"/>
       </w:pPr>
       <w:r>
@@ -26243,6 +26406,7 @@
     </w:tbl>
     <w:p>
       <w:pPr>
+        <w:pStyle w:val="Heading3"/>
         <w:spacing w:lineRule="auto" w:line="360" w:after="160"/>
       </w:pPr>
       <w:r>
@@ -26520,6 +26684,7 @@
     </w:p>
     <w:p>
       <w:pPr>
+        <w:pStyle w:val="Heading3"/>
         <w:spacing w:lineRule="auto" w:line="360" w:after="160"/>
       </w:pPr>
       <w:r>
@@ -26864,6 +27029,7 @@
     </w:tbl>
     <w:p>
       <w:pPr>
+        <w:pStyle w:val="Heading2"/>
         <w:spacing w:lineRule="auto" w:line="360" w:after="160"/>
       </w:pPr>
       <w:r>
@@ -26877,6 +27043,7 @@
     </w:p>
     <w:p>
       <w:pPr>
+        <w:pStyle w:val="Heading3"/>
         <w:spacing w:lineRule="auto" w:line="360" w:after="160"/>
       </w:pPr>
       <w:r>
@@ -26943,6 +27110,7 @@
     </w:p>
     <w:p>
       <w:pPr>
+        <w:pStyle w:val="Heading3"/>
         <w:spacing w:lineRule="auto" w:line="360" w:after="160"/>
       </w:pPr>
       <w:r>
@@ -27038,6 +27206,7 @@
     </w:p>
     <w:p>
       <w:pPr>
+        <w:pStyle w:val="Heading3"/>
         <w:spacing w:lineRule="auto" w:line="360" w:after="160"/>
       </w:pPr>
       <w:r>
@@ -27077,6 +27246,7 @@
     </w:p>
     <w:p>
       <w:pPr>
+        <w:pStyle w:val="Heading2"/>
         <w:spacing w:lineRule="auto" w:line="360" w:after="160"/>
       </w:pPr>
       <w:r>
@@ -27090,6 +27260,7 @@
     </w:p>
     <w:p>
       <w:pPr>
+        <w:pStyle w:val="Heading3"/>
         <w:spacing w:lineRule="auto" w:line="360" w:after="160"/>
       </w:pPr>
       <w:r>
@@ -27467,6 +27638,7 @@
     </w:tbl>
     <w:p>
       <w:pPr>
+        <w:pStyle w:val="Heading3"/>
         <w:spacing w:lineRule="auto" w:line="360" w:after="160"/>
       </w:pPr>
       <w:r>
@@ -27808,6 +27980,7 @@
     </w:p>
     <w:p>
       <w:pPr>
+        <w:pStyle w:val="Heading3"/>
         <w:spacing w:lineRule="auto" w:line="360" w:after="160"/>
       </w:pPr>
       <w:r>
@@ -27847,6 +28020,7 @@
     </w:p>
     <w:p>
       <w:pPr>
+        <w:pStyle w:val="Heading2"/>
         <w:spacing w:lineRule="auto" w:line="360" w:after="160"/>
       </w:pPr>
       <w:r>
@@ -27860,6 +28034,7 @@
     </w:p>
     <w:p>
       <w:pPr>
+        <w:pStyle w:val="Heading3"/>
         <w:spacing w:lineRule="auto" w:line="360" w:after="160"/>
       </w:pPr>
       <w:r>
@@ -27995,6 +28170,7 @@
     </w:p>
     <w:p>
       <w:pPr>
+        <w:pStyle w:val="Heading3"/>
         <w:spacing w:lineRule="auto" w:line="360" w:after="160"/>
       </w:pPr>
       <w:r>
@@ -28385,6 +28561,7 @@
     </w:p>
     <w:p>
       <w:pPr>
+        <w:pStyle w:val="Heading3"/>
         <w:spacing w:lineRule="auto" w:line="360" w:after="160"/>
       </w:pPr>
       <w:r>
@@ -28437,6 +28614,7 @@
     </w:p>
     <w:p>
       <w:pPr>
+        <w:pStyle w:val="Heading2"/>
         <w:spacing w:lineRule="auto" w:line="360" w:after="160"/>
       </w:pPr>
       <w:r>
@@ -28450,6 +28628,7 @@
     </w:p>
     <w:p>
       <w:pPr>
+        <w:pStyle w:val="Heading3"/>
         <w:spacing w:lineRule="auto" w:line="360" w:after="160"/>
       </w:pPr>
       <w:r>
@@ -29183,6 +29362,7 @@
     </w:tbl>
     <w:p>
       <w:pPr>
+        <w:pStyle w:val="Heading3"/>
         <w:spacing w:lineRule="auto" w:line="360" w:after="160"/>
       </w:pPr>
       <w:r>
@@ -29251,6 +29431,7 @@
     </w:p>
     <w:p>
       <w:pPr>
+        <w:pStyle w:val="Heading2"/>
         <w:spacing w:lineRule="auto" w:line="360" w:after="160"/>
       </w:pPr>
       <w:r>
@@ -29376,6 +29557,7 @@
     </w:p>
     <w:p>
       <w:pPr>
+        <w:pStyle w:val="Heading2"/>
         <w:spacing w:lineRule="auto" w:line="360" w:after="160"/>
       </w:pPr>
       <w:r>
@@ -29402,6 +29584,7 @@
     </w:p>
     <w:p>
       <w:pPr>
+        <w:pStyle w:val="Heading3"/>
         <w:spacing w:lineRule="auto" w:line="360" w:after="160"/>
       </w:pPr>
       <w:r>
@@ -29899,6 +30082,7 @@
     </w:tbl>
     <w:p>
       <w:pPr>
+        <w:pStyle w:val="Heading3"/>
         <w:spacing w:lineRule="auto" w:line="360" w:after="160"/>
       </w:pPr>
       <w:r>
@@ -30157,6 +30341,7 @@
     </w:p>
     <w:p>
       <w:pPr>
+        <w:pStyle w:val="Heading3"/>
         <w:spacing w:lineRule="auto" w:line="360" w:after="160"/>
       </w:pPr>
       <w:r>
@@ -30618,6 +30803,7 @@
     </w:p>
     <w:p>
       <w:pPr>
+        <w:pStyle w:val="Heading3"/>
         <w:spacing w:lineRule="auto" w:line="360" w:after="160"/>
       </w:pPr>
       <w:r>
@@ -30938,6 +31124,7 @@
     </w:tbl>
     <w:p>
       <w:pPr>
+        <w:pStyle w:val="Heading2"/>
         <w:spacing w:lineRule="auto" w:line="360" w:after="160"/>
       </w:pPr>
       <w:r>
@@ -30964,6 +31151,7 @@
     </w:p>
     <w:p>
       <w:pPr>
+        <w:pStyle w:val="Heading3"/>
         <w:spacing w:lineRule="auto" w:line="360" w:after="160"/>
       </w:pPr>
       <w:r>
@@ -31405,6 +31593,7 @@
     </w:p>
     <w:p>
       <w:pPr>
+        <w:pStyle w:val="Heading3"/>
         <w:spacing w:lineRule="auto" w:line="360" w:after="160"/>
       </w:pPr>
       <w:r>
@@ -31847,6 +32036,7 @@
     </w:p>
     <w:p>
       <w:pPr>
+        <w:pStyle w:val="Heading3"/>
         <w:spacing w:lineRule="auto" w:line="360" w:after="160"/>
       </w:pPr>
       <w:r>
@@ -32289,6 +32479,7 @@
     </w:p>
     <w:p>
       <w:pPr>
+        <w:pStyle w:val="Heading3"/>
         <w:spacing w:lineRule="auto" w:line="360" w:after="160"/>
       </w:pPr>
       <w:r>
@@ -32575,6 +32766,7 @@
     </w:p>
     <w:p>
       <w:pPr>
+        <w:pStyle w:val="Heading2"/>
         <w:spacing w:lineRule="auto" w:line="360" w:after="160"/>
       </w:pPr>
       <w:r>
@@ -33675,6 +33867,7 @@
     </w:tbl>
     <w:p>
       <w:pPr>
+        <w:pStyle w:val="Heading3"/>
         <w:spacing w:lineRule="auto" w:line="360" w:after="160"/>
       </w:pPr>
       <w:r>
@@ -33743,6 +33936,7 @@
     </w:p>
     <w:p>
       <w:pPr>
+        <w:pStyle w:val="Heading1"/>
         <w:spacing w:lineRule="auto" w:line="360" w:after="160"/>
         <w:jc w:val="center"/>
       </w:pPr>
@@ -33861,6 +34055,7 @@
     </w:p>
     <w:p>
       <w:pPr>
+        <w:pStyle w:val="Heading1"/>
         <w:spacing w:lineRule="auto" w:line="360" w:after="160"/>
         <w:jc w:val="center"/>
       </w:pPr>
@@ -33966,6 +34161,7 @@
     </w:p>
     <w:p>
       <w:pPr>
+        <w:pStyle w:val="Heading1"/>
         <w:spacing w:lineRule="auto" w:line="360" w:after="160"/>
         <w:jc w:val="center"/>
       </w:pPr>
@@ -33994,6 +34190,7 @@
     </w:p>
     <w:p>
       <w:pPr>
+        <w:pStyle w:val="Heading2"/>
         <w:spacing w:lineRule="auto" w:line="360" w:after="160"/>
       </w:pPr>
       <w:r>
@@ -34033,6 +34230,7 @@
     </w:p>
     <w:p>
       <w:pPr>
+        <w:pStyle w:val="Heading2"/>
         <w:spacing w:lineRule="auto" w:line="360" w:after="160"/>
       </w:pPr>
       <w:r>
@@ -34072,6 +34270,7 @@
     </w:p>
     <w:p>
       <w:pPr>
+        <w:pStyle w:val="Heading2"/>
         <w:spacing w:lineRule="auto" w:line="360" w:after="160"/>
       </w:pPr>
       <w:r>
@@ -34111,6 +34310,7 @@
     </w:p>
     <w:p>
       <w:pPr>
+        <w:pStyle w:val="Heading2"/>
         <w:spacing w:lineRule="auto" w:line="360" w:after="160"/>
       </w:pPr>
       <w:r>
@@ -34150,6 +34350,7 @@
     </w:p>
     <w:p>
       <w:pPr>
+        <w:pStyle w:val="Heading2"/>
         <w:spacing w:lineRule="auto" w:line="360" w:after="160"/>
       </w:pPr>
       <w:r>
@@ -34189,6 +34390,7 @@
     </w:p>
     <w:p>
       <w:pPr>
+        <w:pStyle w:val="Heading2"/>
         <w:spacing w:lineRule="auto" w:line="360" w:after="160"/>
       </w:pPr>
       <w:r>
@@ -34241,6 +34443,7 @@
     </w:p>
     <w:p>
       <w:pPr>
+        <w:pStyle w:val="Heading2"/>
         <w:spacing w:lineRule="auto" w:line="360" w:after="160"/>
       </w:pPr>
       <w:r>
@@ -34306,6 +34509,7 @@
     </w:p>
     <w:p>
       <w:pPr>
+        <w:pStyle w:val="Heading2"/>
         <w:spacing w:lineRule="auto" w:line="360" w:after="160"/>
       </w:pPr>
       <w:r>
@@ -34358,6 +34562,7 @@
     </w:p>
     <w:p>
       <w:pPr>
+        <w:pStyle w:val="Heading2"/>
         <w:spacing w:lineRule="auto" w:line="360" w:after="160"/>
       </w:pPr>
       <w:r>
@@ -34397,6 +34602,7 @@
     </w:p>
     <w:p>
       <w:pPr>
+        <w:pStyle w:val="Heading2"/>
         <w:spacing w:lineRule="auto" w:line="360" w:after="160"/>
       </w:pPr>
       <w:r>
@@ -34514,6 +34720,7 @@
     </w:p>
     <w:p>
       <w:pPr>
+        <w:pStyle w:val="Heading2"/>
         <w:spacing w:lineRule="auto" w:line="360" w:after="160"/>
       </w:pPr>
       <w:r>
@@ -34553,6 +34760,7 @@
     </w:p>
     <w:p>
       <w:pPr>
+        <w:pStyle w:val="Heading2"/>
         <w:spacing w:lineRule="auto" w:line="360" w:after="160"/>
       </w:pPr>
       <w:r>
@@ -34635,6 +34843,7 @@
     </w:p>
     <w:p>
       <w:pPr>
+        <w:pStyle w:val="Heading1"/>
         <w:spacing w:lineRule="auto" w:line="360" w:after="160"/>
         <w:jc w:val="center"/>
       </w:pPr>

</xml_diff>